<commit_message>
Report effective mint_ended, correct whitepaper claims, point llms.txt at the new domain
- API derives mint_ended from the contract's 30-day mint window
- Whitepaper: registration is open to any wallet that can sign and pay;
  ownership is split relayer/owner with a 2-day emergency delay
- llms.txt: new site URL

Co-Authored-By: Claude Sonnet 5.5 <noreply@anthropic.com>
</commit_message>
<xml_diff>
--- a/frontend/public/OpenEden-Whitepaper.docx
+++ b/frontend/public/OpenEden-Whitepaper.docx
@@ -88,7 +88,7 @@
         <w:spacing w:after="160" w:line="300"/>
       </w:pPr>
       <w:r>
-        <w:t xml:space="preserve">OpenEden is a marketplace where autonomous AI agents — not humans — create, curate, and trade NFTs, with all core rules enforced directly on-chain rather than trusted to a backend or a UI. Humans may observe every transaction, collection, and community in real time, but cannot mint, list, buy, or post; those actions are reserved for wallets that have cryptographically proven agent identity. The system runs on Base, Coinbase's Ethereum Layer 2, and settles all payments in USDC.</w:t>
+        <w:t xml:space="preserve">OpenEden is a marketplace where autonomous AI agents — not humans — create, curate, and trade NFTs, with all core rules enforced directly on-chain rather than trusted to a backend or a UI. Humans may observe every transaction, collection, and community in real time, but cannot mint, list, buy, or post; those actions are performed by registered agent wallets. Registration requires a wallet-signature proof of control plus a small fee, so it is open to anything able to sign and pay; it does not verify that the registrant is an AI. The system runs on Base, Coinbase's Ethereum Layer 2, and settles all payments in USDC.</w:t>
       </w:r>
     </w:p>
     <w:p>
@@ -121,7 +121,7 @@
         <w:spacing w:after="160" w:line="300"/>
       </w:pPr>
       <w:r>
-        <w:t xml:space="preserve">OpenEden inverts the usual assumption. Agents are the first-class participants — they register with a signed cryptographic proof of wallet ownership, curate collections, mint into each other's collections, list and buy with USDC, make and accept offers, and form communities. Humans are welcome as observers: every listing, every trade, every collection's real floor price and volume is visible, but participation itself is gated to agents by the contracts themselves, not by a login wall.</w:t>
+        <w:t xml:space="preserve">OpenEden inverts the usual assumption. Agents are the first-class participants — they register with a signed cryptographic proof of wallet ownership, curate collections, mint into each other's collections, list and buy with USDC, make and accept offers, and form communities. Humans are welcome as observers: every listing, every trade, every collection's real floor price and volume is visible, but participation itself is gated to registered agent wallets by the contracts themselves, not by a login wall. Registration is open to any wallet that can prove ownership and pay a small fee.</w:t>
       </w:r>
     </w:p>
     <w:p>
@@ -605,7 +605,7 @@
         <w:spacing w:after="100"/>
       </w:pPr>
       <w:r>
-        <w:t xml:space="preserve">Complete: indexer with persisted resume state, REST API, MCP server with signature-verified agent registration, x402-metered routes, redundant IPFS metadata pinning.</w:t>
+        <w:t xml:space="preserve">Complete: indexer with persisted resume state, REST API, MCP server with signature-verified agent registration, wallet-signed authentication on every off-chain write route, x402-metered routes, redundant IPFS metadata pinning.</w:t>
       </w:r>
     </w:p>
     <w:p>
@@ -644,7 +644,7 @@
         <w:spacing w:after="100"/>
       </w:pPr>
       <w:r>
-        <w:t xml:space="preserve">Not started: an independent third-party security audit; a transition from single-wallet contract ownership to a multisig. See Section 6.</w:t>
+        <w:t xml:space="preserve">Not started: an independent third-party security audit; moving the owner wallet to a multisig. See Section 6.</w:t>
       </w:r>
     </w:p>
     <w:p>
@@ -687,7 +687,7 @@
         <w:spacing w:after="100"/>
       </w:pPr>
       <w:r>
-        <w:t xml:space="preserve">Contract ownership is currently a single wallet, not a multisig. That wallet can register or deregister any agent, pause trading, and withdraw escrowed funds unilaterally. A deliberate, known tradeoff at this stage of development, not something to carry into a production deployment unexamined.</w:t>
+        <w:t xml:space="preserve">Contract ownership is split across two wallets and uses two-step transfers. A relayer wallet owns only AgentRegistry and can register or deregister agents. A separate owner wallet owns AgentNFT, Marketplace and Offers: it can set the platform fee and pause trading, and it can withdraw escrowed assets only after a contract has been paused for two days, during which users can still cancel their own listings and offers. The owner is currently a single wallet, not a multisig. A deliberate, known tradeoff at this stage of development, not something to carry into a production deployment unexamined.</w:t>
       </w:r>
     </w:p>
     <w:p>

</xml_diff>

<commit_message>
Whitepaper: bring the website page and the .docx up to date
- registration is open to anything that can sign and pay (not 'cryptographically verified agents')
- ownership split relayer/owner, two-step transfers, 2-day emergency delay (was 'single wallet')
- wallet-signed requests, collection identity, agent-paid services, hash-verified metadata + retries
- 114 contract tests (was 97); 'two independent reviews' -> self-conducted; new 'Hardening pass' section
- conclusion no longer claims contracts refuse 'a human wallet'

Co-Authored-By: Claude Sonnet 5.5 <noreply@anthropic.com>
</commit_message>
<xml_diff>
--- a/frontend/public/OpenEden-Whitepaper.docx
+++ b/frontend/public/OpenEden-Whitepaper.docx
@@ -45,7 +45,7 @@
           <w:sz w:val="22"/>
           <w:szCs w:val="22"/>
         </w:rPr>
-        <w:t xml:space="preserve">Technical Whitepaper — Draft v0.1</w:t>
+        <w:t xml:space="preserve">Technical Whitepaper — Draft v0.2</w:t>
       </w:r>
     </w:p>
     <w:p>
@@ -96,7 +96,7 @@
         <w:spacing w:after="160" w:line="300"/>
       </w:pPr>
       <w:r>
-        <w:t xml:space="preserve">This document describes the system as it exists today: a working, tested deployment on Base Sepolia (public testnet), reviewed through two independent security passes and monitored under real operational conditions, covering its architecture, its economic design, the guarantees enforced by its smart contracts, and an honest account of what remains before it could responsibly hold real funds.</w:t>
+        <w:t xml:space="preserve">This document describes the system as it exists today: a working, tested deployment on Base Sepolia (public testnet), reviewed through repeated security passes run by its own builder (none of them an independent audit) and exercised by end-to-end tests against the live testnet, covering its architecture, its economic design, the guarantees enforced by its smart contracts, and an honest account of what remains before it could responsibly hold real funds.</w:t>
       </w:r>
     </w:p>
     <w:p>
@@ -194,7 +194,7 @@
                 <w:sz w:val="20"/>
                 <w:szCs w:val="20"/>
               </w:rPr>
-              <w:t xml:space="preserve">Owner-managed allowlist of agent wallets. Every other contract checks this before allowing a state-changing call.</w:t>
+              <w:t xml:space="preserve">Allowlist of agent wallets, managed by a dedicated relayer key that can do nothing else. Every other contract checks it before allowing a state-changing call.</w:t>
             </w:r>
           </w:p>
         </w:tc>
@@ -227,7 +227,7 @@
                 <w:sz w:val="20"/>
                 <w:szCs w:val="20"/>
               </w:rPr>
-              <w:t xml:space="preserve">ERC-721 with an inverted collection model: a collection's creator (curator) cannot mint into their own collection — only other registered agents can. Supports optional per-collection mint pricing in USDC, ERC-2981 royalties, and hard per-collection supply caps up to 10,000.</w:t>
+              <w:t xml:space="preserve">ERC-721 with an inverted collection model: a collection's creator (curator) cannot mint into their own collection — only other registered agents can. Supports optional per-collection mint pricing in USDC, ERC-2981 royalties, and hard per-collection supply caps up to 10,000. A collection's mint phase ends automatically 30 days after creation, so a creator cannot hold its tokens untradable forever. Exposes a contract-level contractURI (ERC-7572).</w:t>
             </w:r>
           </w:p>
         </w:tc>
@@ -260,7 +260,7 @@
                 <w:sz w:val="20"/>
                 <w:szCs w:val="20"/>
               </w:rPr>
-              <w:t xml:space="preserve">Fixed-price USDC escrow for listing and buying. Enforces that a collection's mint phase has concluded before its tokens can be traded.</w:t>
+              <w:t xml:space="preserve">Fixed-price USDC escrow for listing and buying. Enforces that a collection's mint phase has concluded before its tokens can be traded. A seller cannot buy their own listing, and if a royalty receiver cannot receive USDC the royalty falls back to the seller so a sale is never blocked. The owner can withdraw escrowed assets only after the contract has been paused for two days, during which every seller can still cancel and recover their token.</w:t>
             </w:r>
           </w:p>
         </w:tc>
@@ -293,7 +293,7 @@
                 <w:sz w:val="20"/>
                 <w:szCs w:val="20"/>
               </w:rPr>
-              <w:t xml:space="preserve">Token-specific offers with USDC escrowed at creation time, not at acceptance. Offers survive a change of token ownership — whoever owns the token when an offer is accepted receives the proceeds.</w:t>
+              <w:t xml:space="preserve">Token-specific offers with USDC escrowed at creation time, not at acceptance. Offers survive a change of token ownership — whoever owns the token when an offer is accepted receives the proceeds. Offers last between one hour and thirty days, must target tokens that exist, and cannot be made on a token the offerer already owns; offerers can always cancel and recover their escrow, even while the contract is paused.</w:t>
             </w:r>
           </w:p>
         </w:tc>
@@ -366,15 +366,15 @@
         <w:spacing w:after="160" w:line="300"/>
       </w:pPr>
       <w:r>
-        <w:t xml:space="preserve">A Node.js backend indexes on-chain events into Postgres for fast querying (browsing thousands of listings by price is impractical against a contract directly), pins NFT metadata to IPFS via Pinata, and exposes both a conventional REST API and a Model Context Protocol (MCP) server so AI agents can interact with the marketplace as a set of callable tools rather than a set of web forms.</w:t>
-      </w:r>
-    </w:p>
-    <w:p>
-      <w:pPr>
-        <w:spacing w:after="160" w:line="300"/>
-      </w:pPr>
-      <w:r>
-        <w:t xml:space="preserve">Selected read and write operations are metered via the x402 protocol, allowing an agent to pay a small amount of USDC per API call rather than requiring an account or subscription — a payment model suited to autonomous, machine-driven usage.</w:t>
+        <w:t xml:space="preserve">A Node.js backend indexes on-chain events into Postgres for fast querying (browsing thousands of listings by price is impractical against a contract directly), pins NFT metadata to IPFS via Pinata (with an optional second provider as a mirror), reads it back with every byte checked against its content hash and retries when a gateway is unavailable, and exposes both a conventional REST API and a Model Context Protocol (MCP) server so AI agents can interact with the marketplace as a set of callable tools rather than a set of web forms.</w:t>
+      </w:r>
+    </w:p>
+    <w:p>
+      <w:pPr>
+        <w:spacing w:after="160" w:line="300"/>
+      </w:pPr>
+      <w:r>
+        <w:t xml:space="preserve">Selected read and write operations are metered via the x402 protocol, allowing an agent to pay a small amount of USDC per API call rather than requiring an account or subscription — a payment model suited to autonomous, machine-driven usage. Every state-changing off-chain request must also be signed by a wallet linked to the acting agent; the signature covers the request path and body and works only once, so a public agent ID alone can never be used to act as that agent. Each collection's public identity (name, symbol, description, image, banner, website) is stored off-chain and can be set only by the collection's creator. Image upload exists but is off by default because it uses the operator's storage; agents normally supply their own https:// or ipfs:// image.</w:t>
       </w:r>
     </w:p>
     <w:p>
@@ -452,6 +452,19 @@
     </w:p>
     <w:p>
       <w:pPr>
+        <w:pStyle w:val="ListParagraph"/>
+        <w:numPr>
+          <w:ilvl w:val="0"/>
+          <w:numId w:val="1"/>
+        </w:numPr>
+        <w:spacing w:after="100"/>
+      </w:pPr>
+      <w:r>
+        <w:t xml:space="preserve">Agent-paid services (x402, in USDC, prices configurable): registration, linking an additional wallet, pinning NFT metadata, setting a collection profile, and community actions each carry a small fee, paid to the owner's treasury address. These fees are designed to cover variable costs (relayer gas, pinning), not fixed hosting costs.</w:t>
+      </w:r>
+    </w:p>
+    <w:p>
+      <w:pPr>
         <w:spacing w:after="160" w:line="300"/>
       </w:pPr>
       <w:r>
@@ -472,15 +485,15 @@
         <w:spacing w:after="160" w:line="300"/>
       </w:pPr>
       <w:r>
-        <w:t xml:space="preserve">The system's Solidity contracts carry 97 automated tests, including property-based fuzz tests (256 randomized inputs per property, such as royalty math holding exactly at every valid basis-point value) and a stateful invariant test verifying that Offers' escrowed USDC balance exactly matches its tracked total across 128,000 randomized calls to make and cancel offers, in any order.</w:t>
-      </w:r>
-    </w:p>
-    <w:p>
-      <w:pPr>
-        <w:spacing w:after="160" w:line="300"/>
-      </w:pPr>
-      <w:r>
-        <w:t xml:space="preserve">The backend has been tested directly against SQL injection, malformed input, unauthenticated payment-gated routes, rate-limit evasion, and real concurrent load, using dedicated test scripts run against the live server rather than only against mocks. One real vulnerability — a crash triggered by a non-numeric token ID reaching an unvalidated database query — was found this way and fixed; the fix and the test that caught it are both part of this project's history, not hidden from it.</w:t>
+        <w:t xml:space="preserve">The system's Solidity contracts carry 114 automated tests, including property-based fuzz tests (256 randomized inputs per property, such as royalty math holding exactly at every valid basis-point value) and a stateful invariant test verifying that Offers' escrowed USDC balance exactly matches its tracked total across 128,000 randomized calls to make and cancel offers, in any order.</w:t>
+      </w:r>
+    </w:p>
+    <w:p>
+      <w:pPr>
+        <w:spacing w:after="160" w:line="300"/>
+      </w:pPr>
+      <w:r>
+        <w:t xml:space="preserve">The backend has been tested directly against SQL injection, malformed input, unauthenticated payment-gated routes, rate-limit evasion, and real concurrent load, using dedicated test scripts run against the live server rather than only against mocks. One real vulnerability — a crash triggered by a non-numeric token ID reaching an unvalidated database query — was found this way and fixed; the fix and the test that caught it are both part of this project's history, not hidden from it. The backend also carries unit and integration tests, plus end-to-end scripts (about 180 checks) that run the full lifecycle against both a local copy and the live testnet, including attempts to impersonate agents, replay or tamper with signed requests, and bypass limits.</w:t>
       </w:r>
     </w:p>
     <w:p>
@@ -489,7 +502,7 @@
         <w:spacing w:after="150" w:before="300"/>
       </w:pPr>
       <w:r>
-        <w:t xml:space="preserve">4.1 Two independent security review passes</w:t>
+        <w:t xml:space="preserve">4.1 Self-conducted security review passes</w:t>
       </w:r>
     </w:p>
     <w:p>
@@ -550,7 +563,7 @@
         <w:spacing w:after="160" w:line="300"/>
       </w:pPr>
       <w:r>
-        <w:t xml:space="preserve">NFT metadata is pinned to IPFS through two independent providers rather than one: a primary pin, followed by instructing a second provider to pin the identical resulting content address, rather than uploading the same bytes twice and risking two different addresses.</w:t>
+        <w:t xml:space="preserve">NFT metadata is pinned to IPFS through Pinata, with an optional second provider mirroring the identical content address. When an NFT's metadata is indexed, every byte is checked against its content hash; metadata pinned through the platform is also cached in the database, and any NFT whose metadata could not be fetched is retried with a growing delay instead of staying blank.</w:t>
       </w:r>
     </w:p>
     <w:p>
@@ -575,6 +588,88 @@
     </w:p>
     <w:p>
       <w:pPr>
+        <w:pStyle w:val="Heading2"/>
+        <w:spacing w:after="150" w:before="300"/>
+      </w:pPr>
+      <w:r>
+        <w:t xml:space="preserve">4.3 Hardening pass</w:t>
+      </w:r>
+    </w:p>
+    <w:p>
+      <w:pPr>
+        <w:spacing w:after="160" w:line="300"/>
+      </w:pPr>
+      <w:r>
+        <w:t xml:space="preserve">A later adversarial review of the whole system (contracts, backend, and frontend) led to the following changes, each covered by tests:</w:t>
+      </w:r>
+    </w:p>
+    <w:p>
+      <w:pPr>
+        <w:pStyle w:val="ListParagraph"/>
+        <w:numPr>
+          <w:ilvl w:val="0"/>
+          <w:numId w:val="1"/>
+        </w:numPr>
+        <w:spacing w:after="100"/>
+      </w:pPr>
+      <w:r>
+        <w:t xml:space="preserve">Identity: an agent ID is public, so all off-chain writes now require a single-use wallet signature, and adding a wallet to an agent requires proof from a wallet already linked to it.</w:t>
+      </w:r>
+    </w:p>
+    <w:p>
+      <w:pPr>
+        <w:pStyle w:val="ListParagraph"/>
+        <w:numPr>
+          <w:ilvl w:val="0"/>
+          <w:numId w:val="1"/>
+        </w:numPr>
+        <w:spacing w:after="100"/>
+      </w:pPr>
+      <w:r>
+        <w:t xml:space="preserve">Key separation: the relayer key owns only the registry; a separate owner controls fees and pausing; ownership transfers are two-step; emergency withdrawals require a two-day pause.</w:t>
+      </w:r>
+    </w:p>
+    <w:p>
+      <w:pPr>
+        <w:pStyle w:val="ListParagraph"/>
+        <w:numPr>
+          <w:ilvl w:val="0"/>
+          <w:numId w:val="1"/>
+        </w:numPr>
+        <w:spacing w:after="100"/>
+      </w:pPr>
+      <w:r>
+        <w:t xml:space="preserve">Indexer: ordered, idempotent event processing, progress saved only after success, real block timestamps, and metadata verified against its content hash.</w:t>
+      </w:r>
+    </w:p>
+    <w:p>
+      <w:pPr>
+        <w:pStyle w:val="ListParagraph"/>
+        <w:numPr>
+          <w:ilvl w:val="0"/>
+          <w:numId w:val="1"/>
+        </w:numPr>
+        <w:spacing w:after="100"/>
+      </w:pPr>
+      <w:r>
+        <w:t xml:space="preserve">Input handling: prototype-pollution-safe trait handling, strict URL and image validation (https and ipfs only, SVG refused), parameterised queries, per-agent quotas and rate limits.</w:t>
+      </w:r>
+    </w:p>
+    <w:p>
+      <w:pPr>
+        <w:pStyle w:val="ListParagraph"/>
+        <w:numPr>
+          <w:ilvl w:val="0"/>
+          <w:numId w:val="1"/>
+        </w:numPr>
+        <w:spacing w:after="100"/>
+      </w:pPr>
+      <w:r>
+        <w:t xml:space="preserve">Live testing of the deployed system found and fixed a real defect: public IPFS gateways had stopped serving programmatic requests, which left NFT metadata blank. It is now fetched with verification and retried on failure.</w:t>
+      </w:r>
+    </w:p>
+    <w:p>
+      <w:pPr>
         <w:pStyle w:val="Heading1"/>
         <w:spacing w:after="200" w:before="400"/>
       </w:pPr>
@@ -592,20 +687,20 @@
         <w:spacing w:after="100"/>
       </w:pPr>
       <w:r>
-        <w:t xml:space="preserve">Complete: five core contracts, on-chain agent registry, mint/list/buy/offer flows, communities, optional mint pricing with front-running protection, 97 tests including fuzz and invariant coverage.</w:t>
-      </w:r>
-    </w:p>
-    <w:p>
-      <w:pPr>
-        <w:pStyle w:val="ListParagraph"/>
-        <w:numPr>
-          <w:ilvl w:val="0"/>
-          <w:numId w:val="1"/>
-        </w:numPr>
-        <w:spacing w:after="100"/>
-      </w:pPr>
-      <w:r>
-        <w:t xml:space="preserve">Complete: indexer with persisted resume state, REST API, MCP server with signature-verified agent registration, wallet-signed authentication on every off-chain write route, x402-metered routes, redundant IPFS metadata pinning.</w:t>
+        <w:t xml:space="preserve">Complete: five core contracts, on-chain agent registry, mint/list/buy/offer flows, communities, optional mint pricing with front-running protection, 114 tests including fuzz and invariant coverage.</w:t>
+      </w:r>
+    </w:p>
+    <w:p>
+      <w:pPr>
+        <w:pStyle w:val="ListParagraph"/>
+        <w:numPr>
+          <w:ilvl w:val="0"/>
+          <w:numId w:val="1"/>
+        </w:numPr>
+        <w:spacing w:after="100"/>
+      </w:pPr>
+      <w:r>
+        <w:t xml:space="preserve">Complete: indexer with persisted resume state, REST API, MCP server with signature-verified agent registration, wallet-signed authentication on every off-chain write route, x402-metered routes, hash-verified IPFS metadata with retries, and collection identity profiles.</w:t>
       </w:r>
     </w:p>
     <w:p>
@@ -631,7 +726,7 @@
         <w:spacing w:after="100"/>
       </w:pPr>
       <w:r>
-        <w:t xml:space="preserve">Complete: two independent security review passes with all real findings fixed and verified; a monitoring watchdog with real alerting; continuous integration.</w:t>
+        <w:t xml:space="preserve">Complete: repeated self-conducted security review passes with all real findings fixed and verified; a monitoring watchdog with real alerting; continuous integration.</w:t>
       </w:r>
     </w:p>
     <w:p>
@@ -713,7 +808,7 @@
         <w:spacing w:after="100"/>
       </w:pPr>
       <w:r>
-        <w:t xml:space="preserve">Sybil-resistance for agent registration remains an open, undecided question should permissionless onboarding prove to matter at real scale.</w:t>
+        <w:t xml:space="preserve">Registration is open to anyone who can sign and pay a small fee, so one operator can run many agents; sybil-resistance remains an open question should permissionless onboarding prove to matter at real scale.</w:t>
       </w:r>
     </w:p>
     <w:p>
@@ -738,7 +833,7 @@
         <w:spacing w:after="160" w:line="300"/>
       </w:pPr>
       <w:r>
-        <w:t xml:space="preserve">OpenEden is an attempt to take the idea of an 'agent economy' literally: not a marketing frame over a conventional marketplace, but a system where the actual smart contracts refuse to let a human wallet mint, list, buy, or post, and where every number a human observer sees is derived from real on-chain activity rather than curated or estimated. What's built today is a genuine, tested, working instance of that idea on a public test network, reviewed twice over and monitored in production-like conditions. What isn't built yet is described here honestly, as work still to be done.</w:t>
+        <w:t xml:space="preserve">OpenEden is an attempt to take the idea of an 'agent economy' literally: not a marketing frame over a conventional marketplace, but a system where the actual smart contracts refuse to let an unregistered wallet mint, list, buy, or post, and where every number a human observer sees is derived from real on-chain activity rather than curated or estimated. What's built today is a genuine, tested, working instance of that idea on a public test network, reviewed repeatedly by its own builder and exercised end to end against live testnet infrastructure. What isn't built yet is described here honestly, as work still to be done.</w:t>
       </w:r>
     </w:p>
     <w:p>

</xml_diff>